<commit_message>
docs(backlog): flag existing tentative holds in E05-S06 (C-111)
SCRUM-152. C-111 says a venue unavailability flags affected existing
bookings, but only its open-ended part had been used (T-80), so no story
covered an unexpired Tentative hold inside a new unavailability.

- E05-S06 Scenario 2 flags such a hold Conflicting without releasing it;
  Scenario 6 restores it, or marks it Expired if its expiry passed.
- Booking contract: the Conflicting transition includes unexpired holds.
- New TC_E05S06_08 and its fixme scaffold, kept separate so TC_E05S06_03's
  one-notice-per-Coordinator check still holds.
- Change-log entry extended; backlog, test-case and BDR exports regenerated
  as CAA 241026 and the unmerged CAA 231026 backlog export dropped.
</commit_message>
<xml_diff>
--- a/docs/BACKLOG DECISION REVIEW CAA 241026.docx
+++ b/docs/BACKLOG DECISION REVIEW CAA 241026.docx
@@ -21762,6 +21762,42 @@
       </w:r>
     </w:p>
     <w:p>
+      <w:pPr>
+        <w:pStyle w:val="ListBullet"/>
+      </w:pPr>
+      <w:r>
+        <w:rPr>
+          <w:sz w:val="22"/>
+        </w:rPr>
+        <w:t>C-111 also says affected existing bookings are flagged. Only its open-ended</w:t>
+      </w:r>
+    </w:p>
+    <w:p>
+      <w:r>
+        <w:t>part had been used (T-80), so no story covered an unexpired Tentative hold</w:t>
+      </w:r>
+    </w:p>
+    <w:p>
+      <w:r>
+        <w:t>inside a new unavailability. E05-S06 Scenario 2 now flags such a hold</w:t>
+      </w:r>
+    </w:p>
+    <w:p>
+      <w:r>
+        <w:t>Conflicting without releasing it, Scenario 6 restores it (or marks it Expired</w:t>
+      </w:r>
+    </w:p>
+    <w:p>
+      <w:r>
+        <w:t>if its expiry passed meanwhile), the booking contract's Conflicting</w:t>
+      </w:r>
+    </w:p>
+    <w:p>
+      <w:r>
+        <w:t>transition includes holds, and TC_E05S06_08 is added.</w:t>
+      </w:r>
+    </w:p>
+    <w:p>
       <w:r>
         <w:t>One interpretation for review: a restored booking does not return its event</w:t>
       </w:r>

</xml_diff>